<commit_message>
commit for label changes
</commit_message>
<xml_diff>
--- a/Resources/Template/IncomeSch00Template.docx
+++ b/Resources/Template/IncomeSch00Template.docx
@@ -2886,19 +2886,6 @@
                 <w:lang w:val="en-IN"/>
               </w:rPr>
             </w:pPr>
-            <w:r>
-              <w:rPr>
-                <w:b/>
-              </w:rPr>
-              <w:t>18.</w:t>
-            </w:r>
-            <w:r>
-              <w:rPr>
-                <w:b/>
-                <w:lang w:val="en-IN"/>
-              </w:rPr>
-              <w:t> </w:t>
-            </w:r>
           </w:p>
         </w:tc>
         <w:tc>

</xml_diff>